<commit_message>
Deploying to gh-pages from @ UCD-SERG/serocalculator@bbd14902b90ae3e19122e7c59ed5056631be4dcc 🚀
</commit_message>
<xml_diff>
--- a/dev/vignettes/articles/simulate_xsectionalData.docx
+++ b/dev/vignettes/articles/simulate_xsectionalData.docx
@@ -439,98 +439,6 @@
       </w:r>
       <w:r>
         <w:t xml:space="preserve">these are modeled from all SEES cases across all ages and countries:</w:t>
-      </w:r>
-    </w:p>
-    <w:p>
-      <w:pPr>
-        <w:pStyle w:val="SourceCode"/>
-      </w:pPr>
-      <w:r>
-        <w:rPr>
-          <w:rStyle w:val="VerbatimChar"/>
-        </w:rPr>
-        <w:t xml:space="preserve">#&gt; ── Attaching core tidyverse packages ──────────────────────── tidyverse 2.0.0 ──</w:t>
-      </w:r>
-      <w:r>
-        <w:br/>
-      </w:r>
-      <w:r>
-        <w:rPr>
-          <w:rStyle w:val="VerbatimChar"/>
-        </w:rPr>
-        <w:t xml:space="preserve">#&gt; ✔ dplyr     1.2.1     ✔ readr     2.2.0</w:t>
-      </w:r>
-      <w:r>
-        <w:br/>
-      </w:r>
-      <w:r>
-        <w:rPr>
-          <w:rStyle w:val="VerbatimChar"/>
-        </w:rPr>
-        <w:t xml:space="preserve">#&gt; ✔ forcats   1.0.1     ✔ stringr   1.6.0</w:t>
-      </w:r>
-      <w:r>
-        <w:br/>
-      </w:r>
-      <w:r>
-        <w:rPr>
-          <w:rStyle w:val="VerbatimChar"/>
-        </w:rPr>
-        <w:t xml:space="preserve">#&gt; ✔ ggplot2   4.0.3     ✔ tibble    3.3.1</w:t>
-      </w:r>
-      <w:r>
-        <w:br/>
-      </w:r>
-      <w:r>
-        <w:rPr>
-          <w:rStyle w:val="VerbatimChar"/>
-        </w:rPr>
-        <w:t xml:space="preserve">#&gt; ✔ lubridate 1.9.5     ✔ tidyr     1.3.2</w:t>
-      </w:r>
-      <w:r>
-        <w:br/>
-      </w:r>
-      <w:r>
-        <w:rPr>
-          <w:rStyle w:val="VerbatimChar"/>
-        </w:rPr>
-        <w:t xml:space="preserve">#&gt; ✔ purrr     1.2.2     </w:t>
-      </w:r>
-      <w:r>
-        <w:br/>
-      </w:r>
-      <w:r>
-        <w:rPr>
-          <w:rStyle w:val="VerbatimChar"/>
-        </w:rPr>
-        <w:t xml:space="preserve">#&gt; ── Conflicts ────────────────────────────────────────── tidyverse_conflicts() ──</w:t>
-      </w:r>
-      <w:r>
-        <w:br/>
-      </w:r>
-      <w:r>
-        <w:rPr>
-          <w:rStyle w:val="VerbatimChar"/>
-        </w:rPr>
-        <w:t xml:space="preserve">#&gt; ✖ dplyr::filter() masks stats::filter()</w:t>
-      </w:r>
-      <w:r>
-        <w:br/>
-      </w:r>
-      <w:r>
-        <w:rPr>
-          <w:rStyle w:val="VerbatimChar"/>
-        </w:rPr>
-        <w:t xml:space="preserve">#&gt; ✖ dplyr::lag()    masks stats::lag()</w:t>
-      </w:r>
-      <w:r>
-        <w:br/>
-      </w:r>
-      <w:r>
-        <w:rPr>
-          <w:rStyle w:val="VerbatimChar"/>
-        </w:rPr>
-        <w:t xml:space="preserve">#&gt; ℹ Use the conflicted package (&lt;http://conflicted.r-lib.org/&gt;) to force all conflicts to become errors</w:t>
       </w:r>
     </w:p>
     <w:bookmarkEnd w:id="9"/>
@@ -2756,27 +2664,7 @@
     </w:p>
     <w:p>
       <w:pPr>
-        <w:pStyle w:val="SourceCode"/>
-      </w:pPr>
-      <w:r>
-        <w:rPr>
-          <w:rStyle w:val="VerbatimChar"/>
-        </w:rPr>
-        <w:t xml:space="preserve">#&gt; `geom_line()`: Each group consists of only one observation.</w:t>
-      </w:r>
-      <w:r>
-        <w:br/>
-      </w:r>
-      <w:r>
-        <w:rPr>
-          <w:rStyle w:val="VerbatimChar"/>
-        </w:rPr>
-        <w:t xml:space="preserve">#&gt; ℹ Do you need to adjust the group aesthetic?</w:t>
-      </w:r>
-    </w:p>
-    <w:p>
-      <w:pPr>
-        <w:pStyle w:val="FirstParagraph"/>
+        <w:pStyle w:val="BodyText"/>
       </w:pPr>
       <w:r>
         <w:drawing>

</xml_diff>